<commit_message>
remove test chunk at the end of nepal-population-density
</commit_message>
<xml_diff>
--- a/docs/posts/nepal-population-density/index.docx
+++ b/docs/posts/nepal-population-density/index.docx
@@ -4772,7 +4772,7 @@
         <w:rPr>
           <w:rStyle w:val="VerbatimChar"/>
         </w:rPr>
-        <w:t xml:space="preserve">Rendering started: 2025-08-30 10:26:43.738151 </w:t>
+        <w:t xml:space="preserve">Rendering started: 2025-08-30 11:07:43.663792 </w:t>
       </w:r>
     </w:p>
     <w:p>
@@ -4783,7 +4783,7 @@
         <w:rPr>
           <w:rStyle w:val="VerbatimChar"/>
         </w:rPr>
-        <w:t xml:space="preserve">Rendering completed in: 6.18773821592331 </w:t>
+        <w:t xml:space="preserve">Rendering completed in: 6.46510718663534 </w:t>
       </w:r>
     </w:p>
     <w:bookmarkEnd w:id="42"/>
@@ -9642,7 +9642,7 @@
       </w:r>
     </w:p>
     <w:bookmarkEnd w:id="52"/>
-    <w:bookmarkStart w:id="57" w:name="conclusion"/>
+    <w:bookmarkStart w:id="54" w:name="conclusion"/>
     <w:p>
       <w:pPr>
         <w:pStyle w:val="Heading2"/>
@@ -9697,200 +9697,7 @@
         </w:r>
       </w:hyperlink>
     </w:p>
-    <w:p>
-      <w:pPr>
-        <w:pStyle w:val="SourceCode"/>
-      </w:pPr>
-      <w:r>
-        <w:rPr>
-          <w:rStyle w:val="NormalTok"/>
-        </w:rPr>
-        <w:t xml:space="preserve">grid</w:t>
-      </w:r>
-      <w:r>
-        <w:rPr>
-          <w:rStyle w:val="SpecialCharTok"/>
-        </w:rPr>
-        <w:t xml:space="preserve">::</w:t>
-      </w:r>
-      <w:r>
-        <w:rPr>
-          <w:rStyle w:val="FunctionTok"/>
-        </w:rPr>
-        <w:t xml:space="preserve">grid.text</w:t>
-      </w:r>
-      <w:r>
-        <w:rPr>
-          <w:rStyle w:val="NormalTok"/>
-        </w:rPr>
-        <w:t xml:space="preserve">(</w:t>
-      </w:r>
-      <w:r>
-        <w:br/>
-      </w:r>
-      <w:r>
-        <w:rPr>
-          <w:rStyle w:val="NormalTok"/>
-        </w:rPr>
-        <w:t xml:space="preserve">  </w:t>
-      </w:r>
-      <w:r>
-        <w:rPr>
-          <w:rStyle w:val="StringTok"/>
-        </w:rPr>
-        <w:t xml:space="preserve">"Nepal"</w:t>
-      </w:r>
-      <w:r>
-        <w:rPr>
-          <w:rStyle w:val="NormalTok"/>
-        </w:rPr>
-        <w:t xml:space="preserve">,</w:t>
-      </w:r>
-      <w:r>
-        <w:br/>
-      </w:r>
-      <w:r>
-        <w:rPr>
-          <w:rStyle w:val="NormalTok"/>
-        </w:rPr>
-        <w:t xml:space="preserve">  </w:t>
-      </w:r>
-      <w:r>
-        <w:rPr>
-          <w:rStyle w:val="AttributeTok"/>
-        </w:rPr>
-        <w:t xml:space="preserve">gp =</w:t>
-      </w:r>
-      <w:r>
-        <w:rPr>
-          <w:rStyle w:val="NormalTok"/>
-        </w:rPr>
-        <w:t xml:space="preserve"> grid</w:t>
-      </w:r>
-      <w:r>
-        <w:rPr>
-          <w:rStyle w:val="SpecialCharTok"/>
-        </w:rPr>
-        <w:t xml:space="preserve">::</w:t>
-      </w:r>
-      <w:r>
-        <w:rPr>
-          <w:rStyle w:val="FunctionTok"/>
-        </w:rPr>
-        <w:t xml:space="preserve">gpar</w:t>
-      </w:r>
-      <w:r>
-        <w:rPr>
-          <w:rStyle w:val="NormalTok"/>
-        </w:rPr>
-        <w:t xml:space="preserve">(</w:t>
-      </w:r>
-      <w:r>
-        <w:rPr>
-          <w:rStyle w:val="AttributeTok"/>
-        </w:rPr>
-        <w:t xml:space="preserve">fontfamily =</w:t>
-      </w:r>
-      <w:r>
-        <w:rPr>
-          <w:rStyle w:val="NormalTok"/>
-        </w:rPr>
-        <w:t xml:space="preserve"> </w:t>
-      </w:r>
-      <w:r>
-        <w:rPr>
-          <w:rStyle w:val="StringTok"/>
-        </w:rPr>
-        <w:t xml:space="preserve">"Ananda Namaste"</w:t>
-      </w:r>
-      <w:r>
-        <w:rPr>
-          <w:rStyle w:val="NormalTok"/>
-        </w:rPr>
-        <w:t xml:space="preserve">, </w:t>
-      </w:r>
-      <w:r>
-        <w:rPr>
-          <w:rStyle w:val="AttributeTok"/>
-        </w:rPr>
-        <w:t xml:space="preserve">fontsize =</w:t>
-      </w:r>
-      <w:r>
-        <w:rPr>
-          <w:rStyle w:val="NormalTok"/>
-        </w:rPr>
-        <w:t xml:space="preserve"> </w:t>
-      </w:r>
-      <w:r>
-        <w:rPr>
-          <w:rStyle w:val="DecValTok"/>
-        </w:rPr>
-        <w:t xml:space="preserve">30</w:t>
-      </w:r>
-      <w:r>
-        <w:rPr>
-          <w:rStyle w:val="NormalTok"/>
-        </w:rPr>
-        <w:t xml:space="preserve">)</w:t>
-      </w:r>
-      <w:r>
-        <w:br/>
-      </w:r>
-      <w:r>
-        <w:rPr>
-          <w:rStyle w:val="NormalTok"/>
-        </w:rPr>
-        <w:t xml:space="preserve">)</w:t>
-      </w:r>
-    </w:p>
-    <w:p>
-      <w:pPr>
-        <w:pStyle w:val="FirstParagraph"/>
-      </w:pPr>
-      <w:r>
-        <w:drawing>
-          <wp:inline>
-            <wp:extent cx="4620126" cy="3696101"/>
-            <wp:effectExtent b="0" l="0" r="0" t="0"/>
-            <wp:docPr descr="" title="" id="55" name="Picture"/>
-            <a:graphic>
-              <a:graphicData uri="http://schemas.openxmlformats.org/drawingml/2006/picture">
-                <pic:pic>
-                  <pic:nvPicPr>
-                    <pic:cNvPr descr="index_files/figure-docx/unnamed-chunk-1-1.png" id="56" name="Picture"/>
-                    <pic:cNvPicPr>
-                      <a:picLocks noChangeArrowheads="1" noChangeAspect="1"/>
-                    </pic:cNvPicPr>
-                  </pic:nvPicPr>
-                  <pic:blipFill>
-                    <a:blip r:embed="rId54"/>
-                    <a:stretch>
-                      <a:fillRect/>
-                    </a:stretch>
-                  </pic:blipFill>
-                  <pic:spPr bwMode="auto">
-                    <a:xfrm>
-                      <a:off x="0" y="0"/>
-                      <a:ext cx="4620126" cy="3696101"/>
-                    </a:xfrm>
-                    <a:prstGeom prst="rect">
-                      <a:avLst/>
-                    </a:prstGeom>
-                    <a:noFill/>
-                    <a:ln w="9525">
-                      <a:noFill/>
-                      <a:headEnd/>
-                      <a:tailEnd/>
-                    </a:ln>
-                  </pic:spPr>
-                </pic:pic>
-              </a:graphicData>
-            </a:graphic>
-          </wp:inline>
-        </w:drawing>
-      </w:r>
-    </w:p>
-    <w:bookmarkEnd w:id="57"/>
+    <w:bookmarkEnd w:id="54"/>
     <w:sectPr>
       <w:footnotePr>
         <w:numRestart w:val="eachSect"/>

</xml_diff>

<commit_message>
Add nepal-population-density plot to post
</commit_message>
<xml_diff>
--- a/docs/posts/nepal-population-density/index.docx
+++ b/docs/posts/nepal-population-density/index.docx
@@ -4772,7 +4772,7 @@
         <w:rPr>
           <w:rStyle w:val="VerbatimChar"/>
         </w:rPr>
-        <w:t xml:space="preserve">Rendering started: 2025-08-30 11:07:43.663792 </w:t>
+        <w:t xml:space="preserve">Rendering started: 2025-08-30 12:16:56.874359 </w:t>
       </w:r>
     </w:p>
     <w:p>
@@ -4783,12 +4783,12 @@
         <w:rPr>
           <w:rStyle w:val="VerbatimChar"/>
         </w:rPr>
-        <w:t xml:space="preserve">Rendering completed in: 6.46510718663534 </w:t>
+        <w:t xml:space="preserve">Rendering completed in: 6.1447407523791 </w:t>
       </w:r>
     </w:p>
     <w:bookmarkEnd w:id="42"/>
     <w:bookmarkEnd w:id="43"/>
-    <w:bookmarkStart w:id="48" w:name="post-processing-and-annotation"/>
+    <w:bookmarkStart w:id="51" w:name="post-processing-and-annotation"/>
     <w:p>
       <w:pPr>
         <w:pStyle w:val="Heading2"/>
@@ -4797,7 +4797,7 @@
         <w:t xml:space="preserve">7 Post-Processing and Annotation</w:t>
       </w:r>
     </w:p>
-    <w:bookmarkStart w:id="47" w:name="geographic-labeling"/>
+    <w:bookmarkStart w:id="50" w:name="geographic-labeling"/>
     <w:p>
       <w:pPr>
         <w:pStyle w:val="Heading3"/>
@@ -9364,9 +9364,64 @@
         <w:t xml:space="preserve">  )</w:t>
       </w:r>
     </w:p>
-    <w:bookmarkEnd w:id="47"/>
-    <w:bookmarkEnd w:id="48"/>
-    <w:bookmarkStart w:id="51" w:name="technical-methodology"/>
+    <w:p>
+      <w:pPr>
+        <w:pStyle w:val="CaptionedFigure"/>
+      </w:pPr>
+      <w:r>
+        <w:drawing>
+          <wp:inline>
+            <wp:extent cx="5334000" cy="2909454"/>
+            <wp:effectExtent b="0" l="0" r="0" t="0"/>
+            <wp:docPr descr="Population Density of Nepal" title="" id="48" name="Picture"/>
+            <a:graphic>
+              <a:graphicData uri="http://schemas.openxmlformats.org/drawingml/2006/picture">
+                <pic:pic>
+                  <pic:nvPicPr>
+                    <pic:cNvPr descr="nepal_population_density.png" id="49" name="Picture"/>
+                    <pic:cNvPicPr>
+                      <a:picLocks noChangeArrowheads="1" noChangeAspect="1"/>
+                    </pic:cNvPicPr>
+                  </pic:nvPicPr>
+                  <pic:blipFill>
+                    <a:blip r:embed="rId47"/>
+                    <a:stretch>
+                      <a:fillRect/>
+                    </a:stretch>
+                  </pic:blipFill>
+                  <pic:spPr bwMode="auto">
+                    <a:xfrm>
+                      <a:off x="0" y="0"/>
+                      <a:ext cx="5334000" cy="2909454"/>
+                    </a:xfrm>
+                    <a:prstGeom prst="rect">
+                      <a:avLst/>
+                    </a:prstGeom>
+                    <a:noFill/>
+                    <a:ln w="9525">
+                      <a:noFill/>
+                      <a:headEnd/>
+                      <a:tailEnd/>
+                    </a:ln>
+                  </pic:spPr>
+                </pic:pic>
+              </a:graphicData>
+            </a:graphic>
+          </wp:inline>
+        </w:drawing>
+      </w:r>
+    </w:p>
+    <w:p>
+      <w:pPr>
+        <w:pStyle w:val="ImageCaption"/>
+      </w:pPr>
+      <w:r>
+        <w:t xml:space="preserve">Population Density of Nepal</w:t>
+      </w:r>
+    </w:p>
+    <w:bookmarkEnd w:id="50"/>
+    <w:bookmarkEnd w:id="51"/>
+    <w:bookmarkStart w:id="54" w:name="technical-methodology"/>
     <w:p>
       <w:pPr>
         <w:pStyle w:val="Heading2"/>
@@ -9375,7 +9430,7 @@
         <w:t xml:space="preserve">8 Technical Methodology</w:t>
       </w:r>
     </w:p>
-    <w:bookmarkStart w:id="49" w:name="spatial-data-processing-pipeline"/>
+    <w:bookmarkStart w:id="52" w:name="spatial-data-processing-pipeline"/>
     <w:p>
       <w:pPr>
         <w:pStyle w:val="Heading3"/>
@@ -9460,8 +9515,8 @@
         <w:t xml:space="preserve">: Population values mapped to color gradients using perceptually uniform color spaces</w:t>
       </w:r>
     </w:p>
-    <w:bookmarkEnd w:id="49"/>
-    <w:bookmarkStart w:id="50" w:name="rendering-specifications"/>
+    <w:bookmarkEnd w:id="52"/>
+    <w:bookmarkStart w:id="53" w:name="rendering-specifications"/>
     <w:p>
       <w:pPr>
         <w:pStyle w:val="Heading3"/>
@@ -9546,9 +9601,9 @@
         <w:t xml:space="preserve">: Optimized vertical exaggeration (250/2.5) for clear population peaks</w:t>
       </w:r>
     </w:p>
-    <w:bookmarkEnd w:id="50"/>
-    <w:bookmarkEnd w:id="51"/>
-    <w:bookmarkStart w:id="52" w:name="results-and-applications"/>
+    <w:bookmarkEnd w:id="53"/>
+    <w:bookmarkEnd w:id="54"/>
+    <w:bookmarkStart w:id="55" w:name="results-and-applications"/>
     <w:p>
       <w:pPr>
         <w:pStyle w:val="Heading2"/>
@@ -9641,8 +9696,8 @@
         <w:t xml:space="preserve">: Visual communication of demographic data</w:t>
       </w:r>
     </w:p>
-    <w:bookmarkEnd w:id="52"/>
-    <w:bookmarkStart w:id="54" w:name="conclusion"/>
+    <w:bookmarkEnd w:id="55"/>
+    <w:bookmarkStart w:id="57" w:name="conclusion"/>
     <w:p>
       <w:pPr>
         <w:pStyle w:val="Heading2"/>
@@ -9688,7 +9743,7 @@
       <w:r>
         <w:t xml:space="preserve"> </w:t>
       </w:r>
-      <w:hyperlink r:id="rId53">
+      <w:hyperlink r:id="rId56">
         <w:r>
           <w:rPr>
             <w:rStyle w:val="Hyperlink"/>
@@ -9697,7 +9752,7 @@
         </w:r>
       </w:hyperlink>
     </w:p>
-    <w:bookmarkEnd w:id="54"/>
+    <w:bookmarkEnd w:id="57"/>
     <w:sectPr>
       <w:footnotePr>
         <w:numRestart w:val="eachSect"/>

</xml_diff>

<commit_message>
Working version of overture-data-download
</commit_message>
<xml_diff>
--- a/docs/posts/nepal-population-density/index.docx
+++ b/docs/posts/nepal-population-density/index.docx
@@ -451,51 +451,6 @@
           <w:rStyle w:val="NormalTok"/>
         </w:rPr>
         <w:t xml:space="preserve">(sf)</w:t>
-      </w:r>
-      <w:r>
-        <w:br/>
-      </w:r>
-      <w:r>
-        <w:rPr>
-          <w:rStyle w:val="FunctionTok"/>
-        </w:rPr>
-        <w:t xml:space="preserve">library</w:t>
-      </w:r>
-      <w:r>
-        <w:rPr>
-          <w:rStyle w:val="NormalTok"/>
-        </w:rPr>
-        <w:t xml:space="preserve">(tmap)</w:t>
-      </w:r>
-      <w:r>
-        <w:br/>
-      </w:r>
-      <w:r>
-        <w:rPr>
-          <w:rStyle w:val="FunctionTok"/>
-        </w:rPr>
-        <w:t xml:space="preserve">library</w:t>
-      </w:r>
-      <w:r>
-        <w:rPr>
-          <w:rStyle w:val="NormalTok"/>
-        </w:rPr>
-        <w:t xml:space="preserve">(ggplot2)</w:t>
-      </w:r>
-      <w:r>
-        <w:br/>
-      </w:r>
-      <w:r>
-        <w:rPr>
-          <w:rStyle w:val="FunctionTok"/>
-        </w:rPr>
-        <w:t xml:space="preserve">library</w:t>
-      </w:r>
-      <w:r>
-        <w:rPr>
-          <w:rStyle w:val="NormalTok"/>
-        </w:rPr>
-        <w:t xml:space="preserve">(mapview)</w:t>
       </w:r>
       <w:r>
         <w:br/>
@@ -4772,7 +4727,7 @@
         <w:rPr>
           <w:rStyle w:val="VerbatimChar"/>
         </w:rPr>
-        <w:t xml:space="preserve">Rendering started: 2025-08-30 12:16:56.874359 </w:t>
+        <w:t xml:space="preserve">Rendering started: 2025-08-31 10:19:01.603639 </w:t>
       </w:r>
     </w:p>
     <w:p>
@@ -4783,7 +4738,7 @@
         <w:rPr>
           <w:rStyle w:val="VerbatimChar"/>
         </w:rPr>
-        <w:t xml:space="preserve">Rendering completed in: 6.1447407523791 </w:t>
+        <w:t xml:space="preserve">Rendering completed in: 5.89483489990234 </w:t>
       </w:r>
     </w:p>
     <w:bookmarkEnd w:id="42"/>

</xml_diff>

<commit_message>
Update Work Experience in about page
</commit_message>
<xml_diff>
--- a/docs/posts/nepal-population-density/index.docx
+++ b/docs/posts/nepal-population-density/index.docx
@@ -1347,17 +1347,16 @@
         <w:tblStyle w:val="Table"/>
         <w:tblLook w:firstRow="0" w:lastRow="0" w:firstColumn="0" w:lastColumn="0" w:noHBand="0" w:noVBand="0" w:val="0000"/>
         <w:tblBorders>
+          <w:top w:val="single" w:sz="4" w:space="0" w:color="0758E5"/>
           <w:left w:val="single" w:sz="24" w:space="0" w:color="0758E5"/>
+          <w:bottom w:val="single" w:sz="4" w:space="0" w:color="0758E5"/>
           <w:right w:val="single" w:sz="4" w:space="0" w:color="0758E5"/>
-          <w:top w:val="single" w:sz="4" w:space="0" w:color="0758E5"/>
-          <w:bottom w:val="single" w:sz="4" w:space="0" w:color="0758E5"/>
         </w:tblBorders>
         <w:tblCellMar>
           <w:left w:w="144" w:type="dxa"/>
           <w:right w:w="144" w:type="dxa"/>
         </w:tblCellMar>
-        <w:tblInd w:w="164" w:type="dxa"/>
-        <w:tblW w:type="pct" w:w="100%"/>
+        <w:tblLook w:firstRow="0" w:lastRow="0" w:firstColumn="0" w:lastColumn="0" w:noHBand="0" w:noVBand="0" w:val="0000"/>
       </w:tblPr>
       <w:tr>
         <w:trPr>
@@ -1389,7 +1388,7 @@
                     <a:graphicData uri="http://schemas.openxmlformats.org/drawingml/2006/picture">
                       <pic:pic>
                         <pic:nvPicPr>
-                          <pic:cNvPr descr="C:\Program Files\Quarto\share\formats\docx\note.png" id="25" name="Picture"/>
+                          <pic:cNvPr descr="/opt/quarto/share/formats/docx/note.png" id="25" name="Picture"/>
                           <pic:cNvPicPr>
                             <a:picLocks noChangeArrowheads="1" noChangeAspect="1"/>
                           </pic:cNvPicPr>
@@ -1541,6 +1540,7 @@
               <w:t xml:space="preserve">: EPSG:6207 for accurate representation of Nepal’s geography</w:t>
             </w:r>
           </w:p>
+          <w:p/>
         </w:tc>
       </w:tr>
     </w:tbl>

</xml_diff>